<commit_message>
chore: pre-quick-report baseline (workflows refactor, template updates, decision tickets)
</commit_message>
<xml_diff>
--- a/templates/QUICK REPORT/SUBSTATION CONFIGURATION/1. ID 1 TX 1 FP VI.docx
+++ b/templates/QUICK REPORT/SUBSTATION CONFIGURATION/1. ID 1 TX 1 FP VI.docx
@@ -22,7 +22,17 @@
           <w:szCs w:val="32"/>
           <w:u w:val="single"/>
         </w:rPr>
-        <w:t>SUBSTATION</w:t>
+        <w:t>S</w:t>
+      </w:r>
+      <w:r>
+        <w:rPr>
+          <w:rFonts w:ascii="Tahoma" w:hAnsi="Tahoma" w:cs="Tahoma"/>
+          <w:b/>
+          <w:sz w:val="32"/>
+          <w:szCs w:val="32"/>
+          <w:u w:val="single"/>
+        </w:rPr>
+        <w:t>UBSTATION</w:t>
       </w:r>
       <w:r>
         <w:rPr>
@@ -523,75 +533,54 @@
               </w:rPr>
               <w:t>TRANSFORMER</w:t>
             </w:r>
+          </w:p>
+        </w:tc>
+        <w:tc>
+          <w:tcPr>
+            <w:tcW w:w="426" w:type="dxa"/>
+            <w:tcBorders>
+              <w:top w:val="nil"/>
+              <w:left w:val="single" w:sz="4" w:space="0" w:color="auto"/>
+              <w:bottom w:val="nil"/>
+              <w:right w:val="single" w:sz="4" w:space="0" w:color="auto"/>
+            </w:tcBorders>
+          </w:tcPr>
+          <w:p>
+            <w:pPr>
+              <w:spacing w:after="0" w:line="240" w:lineRule="auto"/>
+              <w:jc w:val="center"/>
+              <w:rPr>
+                <w:rFonts w:ascii="Tahoma" w:hAnsi="Tahoma" w:cs="Tahoma"/>
+                <w:b/>
+                <w:u w:val="single"/>
+              </w:rPr>
+            </w:pPr>
+          </w:p>
+        </w:tc>
+        <w:tc>
+          <w:tcPr>
+            <w:tcW w:w="4819" w:type="dxa"/>
+            <w:tcBorders>
+              <w:top w:val="single" w:sz="4" w:space="0" w:color="auto"/>
+              <w:left w:val="single" w:sz="4" w:space="0" w:color="auto"/>
+              <w:bottom w:val="single" w:sz="4" w:space="0" w:color="auto"/>
+            </w:tcBorders>
+          </w:tcPr>
+          <w:p>
+            <w:pPr>
+              <w:spacing w:after="0" w:line="240" w:lineRule="auto"/>
+              <w:jc w:val="center"/>
+              <w:rPr>
+                <w:rFonts w:ascii="Tahoma" w:hAnsi="Tahoma" w:cs="Tahoma"/>
+                <w:b/>
+              </w:rPr>
+            </w:pPr>
             <w:r>
               <w:rPr>
                 <w:rFonts w:ascii="Tahoma" w:hAnsi="Tahoma" w:cs="Tahoma"/>
                 <w:b/>
               </w:rPr>
-              <w:t xml:space="preserve"> 1 </w:t>
-            </w:r>
-          </w:p>
-        </w:tc>
-        <w:tc>
-          <w:tcPr>
-            <w:tcW w:w="426" w:type="dxa"/>
-            <w:tcBorders>
-              <w:top w:val="nil"/>
-              <w:left w:val="single" w:sz="4" w:space="0" w:color="auto"/>
-              <w:bottom w:val="nil"/>
-              <w:right w:val="single" w:sz="4" w:space="0" w:color="auto"/>
-            </w:tcBorders>
-          </w:tcPr>
-          <w:p>
-            <w:pPr>
-              <w:spacing w:after="0" w:line="240" w:lineRule="auto"/>
-              <w:jc w:val="center"/>
-              <w:rPr>
-                <w:rFonts w:ascii="Tahoma" w:hAnsi="Tahoma" w:cs="Tahoma"/>
-                <w:b/>
-                <w:u w:val="single"/>
-              </w:rPr>
-            </w:pPr>
-          </w:p>
-        </w:tc>
-        <w:tc>
-          <w:tcPr>
-            <w:tcW w:w="4819" w:type="dxa"/>
-            <w:tcBorders>
-              <w:top w:val="single" w:sz="4" w:space="0" w:color="auto"/>
-              <w:left w:val="single" w:sz="4" w:space="0" w:color="auto"/>
-              <w:bottom w:val="single" w:sz="4" w:space="0" w:color="auto"/>
-            </w:tcBorders>
-          </w:tcPr>
-          <w:p>
-            <w:pPr>
-              <w:spacing w:after="0" w:line="240" w:lineRule="auto"/>
-              <w:jc w:val="center"/>
-              <w:rPr>
-                <w:rFonts w:ascii="Tahoma" w:hAnsi="Tahoma" w:cs="Tahoma"/>
-                <w:b/>
-              </w:rPr>
-            </w:pPr>
-            <w:r>
-              <w:rPr>
-                <w:rFonts w:ascii="Tahoma" w:hAnsi="Tahoma" w:cs="Tahoma"/>
-                <w:b/>
-              </w:rPr>
-              <w:t>TRANSFORMER</w:t>
-            </w:r>
-            <w:r>
-              <w:rPr>
-                <w:rFonts w:ascii="Tahoma" w:hAnsi="Tahoma" w:cs="Tahoma"/>
-                <w:b/>
-              </w:rPr>
-              <w:t xml:space="preserve"> 1</w:t>
-            </w:r>
-            <w:r>
-              <w:rPr>
-                <w:rFonts w:ascii="Tahoma" w:hAnsi="Tahoma" w:cs="Tahoma"/>
-                <w:b/>
-              </w:rPr>
-              <w:t xml:space="preserve"> NAMEPLATE</w:t>
+              <w:t>TRANSFORMER NAMEPLATE</w:t>
             </w:r>
           </w:p>
         </w:tc>
@@ -755,7 +744,7 @@
                 <w:rFonts w:ascii="Tahoma" w:hAnsi="Tahoma" w:cs="Tahoma"/>
                 <w:b/>
               </w:rPr>
-              <w:t>TRANSFORMER 2</w:t>
+              <w:t>LVDB</w:t>
             </w:r>
           </w:p>
         </w:tc>
@@ -802,7 +791,14 @@
                 <w:rFonts w:ascii="Tahoma" w:hAnsi="Tahoma" w:cs="Tahoma"/>
                 <w:b/>
               </w:rPr>
-              <w:t>TRANSFORMER 2 NAMEPLATE</w:t>
+              <w:t>LVDB</w:t>
+            </w:r>
+            <w:r>
+              <w:rPr>
+                <w:rFonts w:ascii="Tahoma" w:hAnsi="Tahoma" w:cs="Tahoma"/>
+                <w:b/>
+              </w:rPr>
+              <w:t xml:space="preserve"> NAMEPLATE</w:t>
             </w:r>
           </w:p>
         </w:tc>
@@ -829,13 +825,6 @@
                 <w:b/>
               </w:rPr>
             </w:pPr>
-            <w:r>
-              <w:rPr>
-                <w:rFonts w:ascii="Tahoma" w:hAnsi="Tahoma" w:cs="Tahoma"/>
-                <w:b/>
-              </w:rPr>
-              <w:t>N/A</w:t>
-            </w:r>
           </w:p>
         </w:tc>
         <w:tc>
@@ -878,13 +867,6 @@
                 <w:b/>
               </w:rPr>
             </w:pPr>
-            <w:r>
-              <w:rPr>
-                <w:rFonts w:ascii="Tahoma" w:hAnsi="Tahoma" w:cs="Tahoma"/>
-                <w:b/>
-              </w:rPr>
-              <w:t>N/A</w:t>
-            </w:r>
           </w:p>
         </w:tc>
       </w:tr>
@@ -979,70 +961,56 @@
                 <w:rFonts w:ascii="Tahoma" w:hAnsi="Tahoma" w:cs="Tahoma"/>
                 <w:b/>
               </w:rPr>
-              <w:t>FEEDER PILLAR</w:t>
+              <w:t>EFI</w:t>
             </w:r>
+          </w:p>
+        </w:tc>
+        <w:tc>
+          <w:tcPr>
+            <w:tcW w:w="426" w:type="dxa"/>
+            <w:tcBorders>
+              <w:top w:val="nil"/>
+              <w:left w:val="single" w:sz="4" w:space="0" w:color="auto"/>
+              <w:bottom w:val="nil"/>
+              <w:right w:val="single" w:sz="4" w:space="0" w:color="auto"/>
+            </w:tcBorders>
+          </w:tcPr>
+          <w:p>
+            <w:pPr>
+              <w:spacing w:after="0" w:line="240" w:lineRule="auto"/>
+              <w:jc w:val="center"/>
+              <w:rPr>
+                <w:rFonts w:ascii="Tahoma" w:hAnsi="Tahoma" w:cs="Tahoma"/>
+                <w:b/>
+              </w:rPr>
+            </w:pPr>
+          </w:p>
+        </w:tc>
+        <w:tc>
+          <w:tcPr>
+            <w:tcW w:w="4819" w:type="dxa"/>
+            <w:tcBorders>
+              <w:top w:val="single" w:sz="4" w:space="0" w:color="auto"/>
+              <w:left w:val="single" w:sz="4" w:space="0" w:color="auto"/>
+              <w:bottom w:val="single" w:sz="4" w:space="0" w:color="auto"/>
+              <w:right w:val="single" w:sz="4" w:space="0" w:color="auto"/>
+            </w:tcBorders>
+          </w:tcPr>
+          <w:p>
+            <w:pPr>
+              <w:spacing w:after="0" w:line="240" w:lineRule="auto"/>
+              <w:jc w:val="center"/>
+              <w:rPr>
+                <w:rFonts w:ascii="Tahoma" w:hAnsi="Tahoma" w:cs="Tahoma"/>
+                <w:b/>
+              </w:rPr>
+            </w:pPr>
             <w:r>
               <w:rPr>
                 <w:rFonts w:ascii="Tahoma" w:hAnsi="Tahoma" w:cs="Tahoma"/>
                 <w:b/>
               </w:rPr>
-              <w:t xml:space="preserve"> TX1</w:t>
-            </w:r>
-          </w:p>
-        </w:tc>
-        <w:tc>
-          <w:tcPr>
-            <w:tcW w:w="426" w:type="dxa"/>
-            <w:tcBorders>
-              <w:top w:val="nil"/>
-              <w:left w:val="single" w:sz="4" w:space="0" w:color="auto"/>
-              <w:bottom w:val="nil"/>
-              <w:right w:val="single" w:sz="4" w:space="0" w:color="auto"/>
-            </w:tcBorders>
-          </w:tcPr>
-          <w:p>
-            <w:pPr>
-              <w:spacing w:after="0" w:line="240" w:lineRule="auto"/>
-              <w:jc w:val="center"/>
-              <w:rPr>
-                <w:rFonts w:ascii="Tahoma" w:hAnsi="Tahoma" w:cs="Tahoma"/>
-                <w:b/>
-              </w:rPr>
-            </w:pPr>
-          </w:p>
-        </w:tc>
-        <w:tc>
-          <w:tcPr>
-            <w:tcW w:w="4819" w:type="dxa"/>
-            <w:tcBorders>
-              <w:top w:val="single" w:sz="4" w:space="0" w:color="auto"/>
-              <w:left w:val="single" w:sz="4" w:space="0" w:color="auto"/>
-              <w:bottom w:val="single" w:sz="4" w:space="0" w:color="auto"/>
-              <w:right w:val="single" w:sz="4" w:space="0" w:color="auto"/>
-            </w:tcBorders>
-          </w:tcPr>
-          <w:p>
-            <w:pPr>
-              <w:spacing w:after="0" w:line="240" w:lineRule="auto"/>
-              <w:jc w:val="center"/>
-              <w:rPr>
-                <w:rFonts w:ascii="Tahoma" w:hAnsi="Tahoma" w:cs="Tahoma"/>
-                <w:b/>
-              </w:rPr>
-            </w:pPr>
-            <w:r>
-              <w:rPr>
-                <w:rFonts w:ascii="Tahoma" w:hAnsi="Tahoma" w:cs="Tahoma"/>
-                <w:b/>
-              </w:rPr>
-              <w:t>FEEDER PILLAR</w:t>
-            </w:r>
-            <w:r>
-              <w:rPr>
-                <w:rFonts w:ascii="Tahoma" w:hAnsi="Tahoma" w:cs="Tahoma"/>
-                <w:b/>
-              </w:rPr>
-              <w:t xml:space="preserve"> TX1 NAMEPLATE</w:t>
+              <w:t>SF6 INDICATOR</w:t>
             </w:r>
           </w:p>
         </w:tc>
@@ -1208,663 +1176,15 @@
                 <w:rFonts w:ascii="Tahoma" w:hAnsi="Tahoma" w:cs="Tahoma"/>
                 <w:b/>
               </w:rPr>
-              <w:t>FEEDER PILLAR TX2</w:t>
+              <w:t xml:space="preserve">FIRE EXTINGUISHER </w:t>
             </w:r>
-          </w:p>
-        </w:tc>
-        <w:tc>
-          <w:tcPr>
-            <w:tcW w:w="426" w:type="dxa"/>
-            <w:tcBorders>
-              <w:top w:val="nil"/>
-              <w:left w:val="single" w:sz="4" w:space="0" w:color="auto"/>
-              <w:bottom w:val="nil"/>
-              <w:right w:val="single" w:sz="4" w:space="0" w:color="auto"/>
-            </w:tcBorders>
-          </w:tcPr>
-          <w:p>
-            <w:pPr>
-              <w:spacing w:after="0" w:line="240" w:lineRule="auto"/>
-              <w:jc w:val="center"/>
-              <w:rPr>
-                <w:rFonts w:ascii="Tahoma" w:hAnsi="Tahoma" w:cs="Tahoma"/>
-                <w:b/>
-                <w:u w:val="single"/>
-              </w:rPr>
-            </w:pPr>
-          </w:p>
-        </w:tc>
-        <w:tc>
-          <w:tcPr>
-            <w:tcW w:w="4819" w:type="dxa"/>
-            <w:tcBorders>
-              <w:top w:val="single" w:sz="4" w:space="0" w:color="auto"/>
-              <w:left w:val="single" w:sz="4" w:space="0" w:color="auto"/>
-              <w:bottom w:val="single" w:sz="4" w:space="0" w:color="auto"/>
-              <w:right w:val="single" w:sz="4" w:space="0" w:color="auto"/>
-            </w:tcBorders>
-          </w:tcPr>
-          <w:p>
-            <w:pPr>
-              <w:spacing w:after="0" w:line="240" w:lineRule="auto"/>
-              <w:jc w:val="center"/>
-              <w:rPr>
-                <w:rFonts w:ascii="Tahoma" w:hAnsi="Tahoma" w:cs="Tahoma"/>
-                <w:b/>
-              </w:rPr>
-            </w:pPr>
             <w:r>
               <w:rPr>
                 <w:rFonts w:ascii="Tahoma" w:hAnsi="Tahoma" w:cs="Tahoma"/>
                 <w:b/>
               </w:rPr>
-              <w:t>FEEDER PILLAR TX2 NAMEPLATE</w:t>
-            </w:r>
-          </w:p>
-        </w:tc>
-      </w:tr>
-      <w:tr>
-        <w:trPr>
-          <w:trHeight w:hRule="exact" w:val="3686"/>
-        </w:trPr>
-        <w:tc>
-          <w:tcPr>
-            <w:tcW w:w="4819" w:type="dxa"/>
-            <w:tcBorders>
-              <w:top w:val="single" w:sz="4" w:space="0" w:color="auto"/>
-              <w:left w:val="single" w:sz="4" w:space="0" w:color="auto"/>
-              <w:bottom w:val="single" w:sz="4" w:space="0" w:color="auto"/>
-              <w:right w:val="single" w:sz="4" w:space="0" w:color="auto"/>
-            </w:tcBorders>
-            <w:vAlign w:val="center"/>
-          </w:tcPr>
-          <w:p>
-            <w:pPr>
-              <w:spacing w:after="0" w:line="240" w:lineRule="auto"/>
-              <w:jc w:val="center"/>
-              <w:rPr>
-                <w:rFonts w:ascii="Tahoma" w:hAnsi="Tahoma" w:cs="Tahoma"/>
-                <w:b/>
-              </w:rPr>
-            </w:pPr>
-            <w:r>
-              <w:rPr>
-                <w:rFonts w:ascii="Tahoma" w:hAnsi="Tahoma" w:cs="Tahoma"/>
-                <w:b/>
-              </w:rPr>
-              <w:t>N/A</w:t>
-            </w:r>
-          </w:p>
-        </w:tc>
-        <w:tc>
-          <w:tcPr>
-            <w:tcW w:w="426" w:type="dxa"/>
-            <w:tcBorders>
-              <w:top w:val="nil"/>
-              <w:left w:val="single" w:sz="4" w:space="0" w:color="auto"/>
-              <w:bottom w:val="nil"/>
-              <w:right w:val="single" w:sz="4" w:space="0" w:color="auto"/>
-            </w:tcBorders>
-            <w:vAlign w:val="center"/>
-          </w:tcPr>
-          <w:p>
-            <w:pPr>
-              <w:spacing w:after="0" w:line="240" w:lineRule="auto"/>
-              <w:jc w:val="center"/>
-              <w:rPr>
-                <w:rFonts w:ascii="Tahoma" w:hAnsi="Tahoma" w:cs="Tahoma"/>
-                <w:b/>
-                <w:u w:val="single"/>
-              </w:rPr>
-            </w:pPr>
-          </w:p>
-        </w:tc>
-        <w:tc>
-          <w:tcPr>
-            <w:tcW w:w="4819" w:type="dxa"/>
-            <w:tcBorders>
-              <w:top w:val="single" w:sz="4" w:space="0" w:color="auto"/>
-              <w:left w:val="single" w:sz="4" w:space="0" w:color="auto"/>
-              <w:bottom w:val="single" w:sz="4" w:space="0" w:color="auto"/>
-              <w:right w:val="single" w:sz="4" w:space="0" w:color="auto"/>
-            </w:tcBorders>
-            <w:vAlign w:val="center"/>
-          </w:tcPr>
-          <w:p>
-            <w:pPr>
-              <w:spacing w:after="0" w:line="240" w:lineRule="auto"/>
-              <w:jc w:val="center"/>
-              <w:rPr>
-                <w:rFonts w:ascii="Tahoma" w:hAnsi="Tahoma" w:cs="Tahoma"/>
-                <w:b/>
-              </w:rPr>
-            </w:pPr>
-            <w:r>
-              <w:rPr>
-                <w:rFonts w:ascii="Tahoma" w:hAnsi="Tahoma" w:cs="Tahoma"/>
-                <w:b/>
-              </w:rPr>
-              <w:t>N/A</w:t>
-            </w:r>
-          </w:p>
-        </w:tc>
-      </w:tr>
-    </w:tbl>
-    <w:p>
-      <w:pPr>
-        <w:spacing w:after="0"/>
-        <w:jc w:val="center"/>
-        <w:rPr>
-          <w:rFonts w:ascii="Tahoma" w:hAnsi="Tahoma" w:cs="Tahoma"/>
-          <w:b/>
-          <w:sz w:val="32"/>
-          <w:szCs w:val="32"/>
-          <w:u w:val="single"/>
-        </w:rPr>
-      </w:pPr>
-      <w:r>
-        <w:br w:type="page"/>
-      </w:r>
-      <w:r>
-        <w:rPr>
-          <w:rFonts w:ascii="Tahoma" w:hAnsi="Tahoma" w:cs="Tahoma"/>
-          <w:b/>
-          <w:sz w:val="32"/>
-          <w:szCs w:val="32"/>
-          <w:u w:val="single"/>
-        </w:rPr>
-        <w:lastRenderedPageBreak/>
-        <w:t>SUBSTATION CONDITION</w:t>
-      </w:r>
-    </w:p>
-    <w:p>
-      <w:pPr>
-        <w:spacing w:after="0"/>
-        <w:rPr>
-          <w:rFonts w:ascii="Tahoma" w:hAnsi="Tahoma" w:cs="Tahoma"/>
-          <w:b/>
-          <w:u w:val="single"/>
-        </w:rPr>
-      </w:pPr>
-    </w:p>
-    <w:tbl>
-      <w:tblPr>
-        <w:tblW w:w="10064" w:type="dxa"/>
-        <w:tblInd w:w="-289" w:type="dxa"/>
-        <w:tblBorders>
-          <w:top w:val="single" w:sz="4" w:space="0" w:color="auto"/>
-          <w:left w:val="single" w:sz="4" w:space="0" w:color="auto"/>
-          <w:bottom w:val="single" w:sz="4" w:space="0" w:color="auto"/>
-          <w:right w:val="single" w:sz="4" w:space="0" w:color="auto"/>
-          <w:insideH w:val="single" w:sz="4" w:space="0" w:color="auto"/>
-          <w:insideV w:val="single" w:sz="4" w:space="0" w:color="auto"/>
-        </w:tblBorders>
-        <w:tblLayout w:type="fixed"/>
-        <w:tblLook w:val="04A0" w:firstRow="1" w:lastRow="0" w:firstColumn="1" w:lastColumn="0" w:noHBand="0" w:noVBand="1"/>
-      </w:tblPr>
-      <w:tblGrid>
-        <w:gridCol w:w="4819"/>
-        <w:gridCol w:w="426"/>
-        <w:gridCol w:w="4819"/>
-      </w:tblGrid>
-      <w:tr>
-        <w:tc>
-          <w:tcPr>
-            <w:tcW w:w="4819" w:type="dxa"/>
-            <w:tcBorders>
-              <w:bottom w:val="single" w:sz="4" w:space="0" w:color="auto"/>
-              <w:right w:val="single" w:sz="4" w:space="0" w:color="auto"/>
-            </w:tcBorders>
-          </w:tcPr>
-          <w:p>
-            <w:pPr>
-              <w:spacing w:after="0" w:line="240" w:lineRule="auto"/>
-              <w:jc w:val="center"/>
-              <w:rPr>
-                <w:rFonts w:ascii="Tahoma" w:hAnsi="Tahoma" w:cs="Tahoma"/>
-                <w:b/>
-              </w:rPr>
-            </w:pPr>
-            <w:r>
-              <w:rPr>
-                <w:rFonts w:ascii="Tahoma" w:hAnsi="Tahoma" w:cs="Tahoma"/>
-                <w:b/>
-              </w:rPr>
-              <w:t>EFI</w:t>
-            </w:r>
-          </w:p>
-        </w:tc>
-        <w:tc>
-          <w:tcPr>
-            <w:tcW w:w="426" w:type="dxa"/>
-            <w:tcBorders>
-              <w:top w:val="nil"/>
-              <w:left w:val="single" w:sz="4" w:space="0" w:color="auto"/>
-              <w:bottom w:val="nil"/>
-              <w:right w:val="single" w:sz="4" w:space="0" w:color="auto"/>
-            </w:tcBorders>
-          </w:tcPr>
-          <w:p>
-            <w:pPr>
-              <w:spacing w:after="0" w:line="240" w:lineRule="auto"/>
-              <w:jc w:val="center"/>
-              <w:rPr>
-                <w:rFonts w:ascii="Tahoma" w:hAnsi="Tahoma" w:cs="Tahoma"/>
-                <w:b/>
-              </w:rPr>
-            </w:pPr>
-          </w:p>
-        </w:tc>
-        <w:tc>
-          <w:tcPr>
-            <w:tcW w:w="4819" w:type="dxa"/>
-            <w:tcBorders>
-              <w:left w:val="single" w:sz="4" w:space="0" w:color="auto"/>
-              <w:bottom w:val="single" w:sz="4" w:space="0" w:color="auto"/>
-            </w:tcBorders>
-          </w:tcPr>
-          <w:p>
-            <w:pPr>
-              <w:spacing w:after="0" w:line="240" w:lineRule="auto"/>
-              <w:jc w:val="center"/>
-              <w:rPr>
-                <w:rFonts w:ascii="Tahoma" w:hAnsi="Tahoma" w:cs="Tahoma"/>
-                <w:b/>
-              </w:rPr>
-            </w:pPr>
-            <w:r>
-              <w:rPr>
-                <w:rFonts w:ascii="Tahoma" w:hAnsi="Tahoma" w:cs="Tahoma"/>
-                <w:b/>
-              </w:rPr>
-              <w:t>SF6 INDICATOR</w:t>
-            </w:r>
-          </w:p>
-        </w:tc>
-      </w:tr>
-      <w:tr>
-        <w:trPr>
-          <w:trHeight w:hRule="exact" w:val="3686"/>
-        </w:trPr>
-        <w:tc>
-          <w:tcPr>
-            <w:tcW w:w="4819" w:type="dxa"/>
-            <w:tcBorders>
-              <w:bottom w:val="single" w:sz="4" w:space="0" w:color="auto"/>
-              <w:right w:val="single" w:sz="4" w:space="0" w:color="auto"/>
-            </w:tcBorders>
-            <w:vAlign w:val="center"/>
-          </w:tcPr>
-          <w:p>
-            <w:pPr>
-              <w:spacing w:after="0" w:line="240" w:lineRule="auto"/>
-              <w:jc w:val="center"/>
-              <w:rPr>
-                <w:rFonts w:ascii="Tahoma" w:hAnsi="Tahoma" w:cs="Tahoma"/>
-                <w:b/>
-              </w:rPr>
-            </w:pPr>
-          </w:p>
-        </w:tc>
-        <w:tc>
-          <w:tcPr>
-            <w:tcW w:w="426" w:type="dxa"/>
-            <w:tcBorders>
-              <w:top w:val="nil"/>
-              <w:left w:val="single" w:sz="4" w:space="0" w:color="auto"/>
-              <w:bottom w:val="nil"/>
-              <w:right w:val="single" w:sz="4" w:space="0" w:color="auto"/>
-            </w:tcBorders>
-            <w:vAlign w:val="center"/>
-          </w:tcPr>
-          <w:p>
-            <w:pPr>
-              <w:spacing w:after="0" w:line="240" w:lineRule="auto"/>
-              <w:jc w:val="center"/>
-              <w:rPr>
-                <w:rFonts w:ascii="Tahoma" w:hAnsi="Tahoma" w:cs="Tahoma"/>
-                <w:b/>
-              </w:rPr>
-            </w:pPr>
-          </w:p>
-        </w:tc>
-        <w:tc>
-          <w:tcPr>
-            <w:tcW w:w="4819" w:type="dxa"/>
-            <w:tcBorders>
-              <w:left w:val="single" w:sz="4" w:space="0" w:color="auto"/>
-              <w:bottom w:val="single" w:sz="4" w:space="0" w:color="auto"/>
-            </w:tcBorders>
-            <w:vAlign w:val="center"/>
-          </w:tcPr>
-          <w:p>
-            <w:pPr>
-              <w:spacing w:after="0" w:line="240" w:lineRule="auto"/>
-              <w:jc w:val="center"/>
-              <w:rPr>
-                <w:rFonts w:ascii="Tahoma" w:hAnsi="Tahoma" w:cs="Tahoma"/>
-                <w:b/>
-              </w:rPr>
-            </w:pPr>
-          </w:p>
-        </w:tc>
-      </w:tr>
-      <w:tr>
-        <w:tc>
-          <w:tcPr>
-            <w:tcW w:w="4819" w:type="dxa"/>
-            <w:tcBorders>
-              <w:left w:val="nil"/>
-              <w:bottom w:val="single" w:sz="4" w:space="0" w:color="auto"/>
-              <w:right w:val="nil"/>
-            </w:tcBorders>
-          </w:tcPr>
-          <w:p>
-            <w:pPr>
-              <w:spacing w:after="0" w:line="240" w:lineRule="auto"/>
-              <w:jc w:val="center"/>
-              <w:rPr>
-                <w:rFonts w:ascii="Tahoma" w:hAnsi="Tahoma" w:cs="Tahoma"/>
-                <w:b/>
-              </w:rPr>
-            </w:pPr>
-          </w:p>
-        </w:tc>
-        <w:tc>
-          <w:tcPr>
-            <w:tcW w:w="426" w:type="dxa"/>
-            <w:tcBorders>
-              <w:top w:val="nil"/>
-              <w:left w:val="nil"/>
-              <w:bottom w:val="nil"/>
-              <w:right w:val="nil"/>
-            </w:tcBorders>
-          </w:tcPr>
-          <w:p>
-            <w:pPr>
-              <w:spacing w:after="0" w:line="240" w:lineRule="auto"/>
-              <w:jc w:val="center"/>
-              <w:rPr>
-                <w:rFonts w:ascii="Tahoma" w:hAnsi="Tahoma" w:cs="Tahoma"/>
-                <w:b/>
-              </w:rPr>
-            </w:pPr>
-          </w:p>
-        </w:tc>
-        <w:tc>
-          <w:tcPr>
-            <w:tcW w:w="4819" w:type="dxa"/>
-            <w:tcBorders>
-              <w:left w:val="nil"/>
-              <w:bottom w:val="single" w:sz="4" w:space="0" w:color="auto"/>
-              <w:right w:val="nil"/>
-            </w:tcBorders>
-          </w:tcPr>
-          <w:p>
-            <w:pPr>
-              <w:spacing w:after="0" w:line="240" w:lineRule="auto"/>
-              <w:jc w:val="center"/>
-              <w:rPr>
-                <w:rFonts w:ascii="Tahoma" w:hAnsi="Tahoma" w:cs="Tahoma"/>
-                <w:b/>
-              </w:rPr>
-            </w:pPr>
-          </w:p>
-        </w:tc>
-      </w:tr>
-      <w:tr>
-        <w:tc>
-          <w:tcPr>
-            <w:tcW w:w="4819" w:type="dxa"/>
-            <w:tcBorders>
-              <w:top w:val="single" w:sz="4" w:space="0" w:color="auto"/>
-              <w:bottom w:val="single" w:sz="4" w:space="0" w:color="auto"/>
-              <w:right w:val="single" w:sz="4" w:space="0" w:color="auto"/>
-            </w:tcBorders>
-          </w:tcPr>
-          <w:p>
-            <w:pPr>
-              <w:spacing w:after="0" w:line="240" w:lineRule="auto"/>
-              <w:jc w:val="center"/>
-              <w:rPr>
-                <w:rFonts w:ascii="Tahoma" w:hAnsi="Tahoma" w:cs="Tahoma"/>
-                <w:b/>
-              </w:rPr>
-            </w:pPr>
-            <w:r>
-              <w:rPr>
-                <w:rFonts w:ascii="Tahoma" w:hAnsi="Tahoma" w:cs="Tahoma"/>
-                <w:b/>
-              </w:rPr>
-              <w:t>BATTERY</w:t>
-            </w:r>
-          </w:p>
-        </w:tc>
-        <w:tc>
-          <w:tcPr>
-            <w:tcW w:w="426" w:type="dxa"/>
-            <w:tcBorders>
-              <w:top w:val="nil"/>
-              <w:left w:val="single" w:sz="4" w:space="0" w:color="auto"/>
-              <w:bottom w:val="nil"/>
-              <w:right w:val="single" w:sz="4" w:space="0" w:color="auto"/>
-            </w:tcBorders>
-          </w:tcPr>
-          <w:p>
-            <w:pPr>
-              <w:spacing w:after="0" w:line="240" w:lineRule="auto"/>
-              <w:jc w:val="center"/>
-              <w:rPr>
-                <w:rFonts w:ascii="Tahoma" w:hAnsi="Tahoma" w:cs="Tahoma"/>
-                <w:b/>
-              </w:rPr>
-            </w:pPr>
-          </w:p>
-        </w:tc>
-        <w:tc>
-          <w:tcPr>
-            <w:tcW w:w="4819" w:type="dxa"/>
-            <w:tcBorders>
-              <w:top w:val="single" w:sz="4" w:space="0" w:color="auto"/>
-              <w:left w:val="single" w:sz="4" w:space="0" w:color="auto"/>
-              <w:bottom w:val="single" w:sz="4" w:space="0" w:color="auto"/>
-              <w:right w:val="single" w:sz="4" w:space="0" w:color="auto"/>
-            </w:tcBorders>
-          </w:tcPr>
-          <w:p>
-            <w:pPr>
-              <w:spacing w:after="0" w:line="240" w:lineRule="auto"/>
-              <w:jc w:val="center"/>
-              <w:rPr>
-                <w:rFonts w:ascii="Tahoma" w:hAnsi="Tahoma" w:cs="Tahoma"/>
-                <w:b/>
-              </w:rPr>
-            </w:pPr>
-            <w:r>
-              <w:rPr>
-                <w:rFonts w:ascii="Tahoma" w:hAnsi="Tahoma" w:cs="Tahoma"/>
-                <w:b/>
-              </w:rPr>
-              <w:t>BATTERY NAMEPLATE</w:t>
-            </w:r>
-          </w:p>
-        </w:tc>
-      </w:tr>
-      <w:tr>
-        <w:trPr>
-          <w:trHeight w:hRule="exact" w:val="3686"/>
-        </w:trPr>
-        <w:tc>
-          <w:tcPr>
-            <w:tcW w:w="4819" w:type="dxa"/>
-            <w:tcBorders>
-              <w:bottom w:val="single" w:sz="4" w:space="0" w:color="auto"/>
-              <w:right w:val="single" w:sz="4" w:space="0" w:color="auto"/>
-            </w:tcBorders>
-            <w:vAlign w:val="center"/>
-          </w:tcPr>
-          <w:p>
-            <w:pPr>
-              <w:spacing w:after="0" w:line="240" w:lineRule="auto"/>
-              <w:jc w:val="center"/>
-              <w:rPr>
-                <w:rFonts w:ascii="Tahoma" w:hAnsi="Tahoma" w:cs="Tahoma"/>
-                <w:b/>
-              </w:rPr>
-            </w:pPr>
-            <w:r>
-              <w:rPr>
-                <w:rFonts w:ascii="Tahoma" w:hAnsi="Tahoma" w:cs="Tahoma"/>
-                <w:b/>
-              </w:rPr>
-              <w:t>N/A</w:t>
-            </w:r>
-          </w:p>
-        </w:tc>
-        <w:tc>
-          <w:tcPr>
-            <w:tcW w:w="426" w:type="dxa"/>
-            <w:tcBorders>
-              <w:top w:val="nil"/>
-              <w:left w:val="single" w:sz="4" w:space="0" w:color="auto"/>
-              <w:bottom w:val="nil"/>
-              <w:right w:val="single" w:sz="4" w:space="0" w:color="auto"/>
-            </w:tcBorders>
-            <w:vAlign w:val="center"/>
-          </w:tcPr>
-          <w:p>
-            <w:pPr>
-              <w:spacing w:after="0" w:line="240" w:lineRule="auto"/>
-              <w:jc w:val="center"/>
-              <w:rPr>
-                <w:rFonts w:ascii="Tahoma" w:hAnsi="Tahoma" w:cs="Tahoma"/>
-                <w:b/>
-              </w:rPr>
-            </w:pPr>
-          </w:p>
-        </w:tc>
-        <w:tc>
-          <w:tcPr>
-            <w:tcW w:w="4819" w:type="dxa"/>
-            <w:tcBorders>
-              <w:top w:val="single" w:sz="4" w:space="0" w:color="auto"/>
-              <w:left w:val="single" w:sz="4" w:space="0" w:color="auto"/>
-              <w:bottom w:val="single" w:sz="4" w:space="0" w:color="auto"/>
-              <w:right w:val="single" w:sz="4" w:space="0" w:color="auto"/>
-            </w:tcBorders>
-            <w:vAlign w:val="center"/>
-          </w:tcPr>
-          <w:p>
-            <w:pPr>
-              <w:spacing w:after="0" w:line="240" w:lineRule="auto"/>
-              <w:jc w:val="center"/>
-              <w:rPr>
-                <w:rFonts w:ascii="Tahoma" w:hAnsi="Tahoma" w:cs="Tahoma"/>
-                <w:b/>
-              </w:rPr>
-            </w:pPr>
-            <w:r>
-              <w:rPr>
-                <w:rFonts w:ascii="Tahoma" w:hAnsi="Tahoma" w:cs="Tahoma"/>
-                <w:b/>
-              </w:rPr>
-              <w:t>N/A</w:t>
-            </w:r>
-          </w:p>
-        </w:tc>
-      </w:tr>
-      <w:tr>
-        <w:tc>
-          <w:tcPr>
-            <w:tcW w:w="4819" w:type="dxa"/>
-            <w:tcBorders>
-              <w:top w:val="single" w:sz="4" w:space="0" w:color="auto"/>
-              <w:left w:val="nil"/>
-              <w:bottom w:val="single" w:sz="4" w:space="0" w:color="auto"/>
-              <w:right w:val="nil"/>
-            </w:tcBorders>
-          </w:tcPr>
-          <w:p>
-            <w:pPr>
-              <w:spacing w:after="0" w:line="240" w:lineRule="auto"/>
-              <w:jc w:val="center"/>
-              <w:rPr>
-                <w:rFonts w:ascii="Tahoma" w:hAnsi="Tahoma" w:cs="Tahoma"/>
-                <w:b/>
-              </w:rPr>
-            </w:pPr>
-          </w:p>
-        </w:tc>
-        <w:tc>
-          <w:tcPr>
-            <w:tcW w:w="426" w:type="dxa"/>
-            <w:tcBorders>
-              <w:top w:val="nil"/>
-              <w:left w:val="nil"/>
-              <w:bottom w:val="nil"/>
-              <w:right w:val="nil"/>
-            </w:tcBorders>
-          </w:tcPr>
-          <w:p>
-            <w:pPr>
-              <w:spacing w:after="0" w:line="240" w:lineRule="auto"/>
-              <w:jc w:val="center"/>
-              <w:rPr>
-                <w:rFonts w:ascii="Tahoma" w:hAnsi="Tahoma" w:cs="Tahoma"/>
-                <w:b/>
-                <w:u w:val="single"/>
-              </w:rPr>
-            </w:pPr>
-          </w:p>
-        </w:tc>
-        <w:tc>
-          <w:tcPr>
-            <w:tcW w:w="4819" w:type="dxa"/>
-            <w:tcBorders>
-              <w:top w:val="single" w:sz="4" w:space="0" w:color="auto"/>
-              <w:left w:val="nil"/>
-              <w:bottom w:val="single" w:sz="4" w:space="0" w:color="auto"/>
-              <w:right w:val="nil"/>
-            </w:tcBorders>
-          </w:tcPr>
-          <w:p>
-            <w:pPr>
-              <w:spacing w:after="0" w:line="240" w:lineRule="auto"/>
-              <w:jc w:val="center"/>
-              <w:rPr>
-                <w:rFonts w:ascii="Tahoma" w:hAnsi="Tahoma" w:cs="Tahoma"/>
-                <w:b/>
-              </w:rPr>
-            </w:pPr>
-          </w:p>
-        </w:tc>
-      </w:tr>
-      <w:tr>
-        <w:tc>
-          <w:tcPr>
-            <w:tcW w:w="4819" w:type="dxa"/>
-            <w:tcBorders>
-              <w:top w:val="single" w:sz="4" w:space="0" w:color="auto"/>
-              <w:left w:val="single" w:sz="4" w:space="0" w:color="auto"/>
-              <w:bottom w:val="single" w:sz="4" w:space="0" w:color="auto"/>
-              <w:right w:val="single" w:sz="4" w:space="0" w:color="auto"/>
-            </w:tcBorders>
-          </w:tcPr>
-          <w:p>
-            <w:pPr>
-              <w:spacing w:after="0" w:line="240" w:lineRule="auto"/>
-              <w:jc w:val="center"/>
-              <w:rPr>
-                <w:rFonts w:ascii="Tahoma" w:hAnsi="Tahoma" w:cs="Tahoma"/>
-                <w:b/>
-              </w:rPr>
-            </w:pPr>
-            <w:r>
-              <w:rPr>
-                <w:rFonts w:ascii="Tahoma" w:hAnsi="Tahoma" w:cs="Tahoma"/>
-                <w:b/>
-              </w:rPr>
-              <w:t>FIRE EXTINGUISHER</w:t>
+              <w:br/>
+              <w:t>(SWITCHGEAR ROOM)</w:t>
             </w:r>
           </w:p>
         </w:tc>
@@ -1921,7 +1241,7 @@
                 <w:rFonts w:ascii="Tahoma" w:hAnsi="Tahoma" w:cs="Tahoma"/>
                 <w:b/>
               </w:rPr>
-              <w:t xml:space="preserve"> NAMEPLATE</w:t>
+              <w:t xml:space="preserve"> EXPIRY DATE</w:t>
             </w:r>
           </w:p>
         </w:tc>
@@ -2082,8 +1402,16 @@
                 <w:rFonts w:ascii="Tahoma" w:hAnsi="Tahoma" w:cs="Tahoma"/>
                 <w:b/>
               </w:rPr>
-              <w:t>SWITCHGEAR PANEL NAME</w:t>
+              <w:t xml:space="preserve">FIRE EXTINGUISHER </w:t>
             </w:r>
+            <w:r>
+              <w:rPr>
+                <w:rFonts w:ascii="Tahoma" w:hAnsi="Tahoma" w:cs="Tahoma"/>
+                <w:b/>
+              </w:rPr>
+              <w:br/>
+              <w:t>(TX ROOM)</w:t>
+            </w:r>
           </w:p>
         </w:tc>
         <w:tc>
@@ -2111,10 +1439,8 @@
           <w:tcPr>
             <w:tcW w:w="4819" w:type="dxa"/>
             <w:tcBorders>
-              <w:top w:val="single" w:sz="4" w:space="0" w:color="auto"/>
-              <w:left w:val="single" w:sz="4" w:space="0" w:color="auto"/>
-              <w:bottom w:val="single" w:sz="4" w:space="0" w:color="auto"/>
-              <w:right w:val="single" w:sz="4" w:space="0" w:color="auto"/>
+              <w:left w:val="single" w:sz="4" w:space="0" w:color="auto"/>
+              <w:bottom w:val="single" w:sz="4" w:space="0" w:color="auto"/>
             </w:tcBorders>
           </w:tcPr>
           <w:p>
@@ -2131,7 +1457,7 @@
                 <w:rFonts w:ascii="Tahoma" w:hAnsi="Tahoma" w:cs="Tahoma"/>
                 <w:b/>
               </w:rPr>
-              <w:t>LAST PREVENTIVE MAINTENANCE</w:t>
+              <w:t>FIRE EXTINGUISHER EXPIRY DATE</w:t>
             </w:r>
           </w:p>
         </w:tc>
@@ -2186,10 +1512,8 @@
           <w:tcPr>
             <w:tcW w:w="4819" w:type="dxa"/>
             <w:tcBorders>
-              <w:top w:val="single" w:sz="4" w:space="0" w:color="auto"/>
-              <w:left w:val="single" w:sz="4" w:space="0" w:color="auto"/>
-              <w:bottom w:val="single" w:sz="4" w:space="0" w:color="auto"/>
-              <w:right w:val="single" w:sz="4" w:space="0" w:color="auto"/>
+              <w:left w:val="single" w:sz="4" w:space="0" w:color="auto"/>
+              <w:bottom w:val="single" w:sz="4" w:space="0" w:color="auto"/>
             </w:tcBorders>
             <w:vAlign w:val="center"/>
           </w:tcPr>
@@ -2211,9 +1535,10 @@
             <w:tcW w:w="4819" w:type="dxa"/>
             <w:tcBorders>
               <w:left w:val="nil"/>
-              <w:bottom w:val="nil"/>
+              <w:bottom w:val="single" w:sz="4" w:space="0" w:color="auto"/>
               <w:right w:val="nil"/>
             </w:tcBorders>
+            <w:vAlign w:val="center"/>
           </w:tcPr>
           <w:p>
             <w:pPr>
@@ -2235,27 +1560,28 @@
               <w:bottom w:val="nil"/>
               <w:right w:val="nil"/>
             </w:tcBorders>
-          </w:tcPr>
-          <w:p>
-            <w:pPr>
-              <w:spacing w:after="0" w:line="240" w:lineRule="auto"/>
-              <w:jc w:val="center"/>
-              <w:rPr>
-                <w:rFonts w:ascii="Tahoma" w:hAnsi="Tahoma" w:cs="Tahoma"/>
-                <w:b/>
-              </w:rPr>
-            </w:pPr>
-          </w:p>
-        </w:tc>
-        <w:tc>
-          <w:tcPr>
-            <w:tcW w:w="4819" w:type="dxa"/>
-            <w:tcBorders>
-              <w:top w:val="single" w:sz="4" w:space="0" w:color="auto"/>
+            <w:vAlign w:val="center"/>
+          </w:tcPr>
+          <w:p>
+            <w:pPr>
+              <w:spacing w:after="0" w:line="240" w:lineRule="auto"/>
+              <w:jc w:val="center"/>
+              <w:rPr>
+                <w:rFonts w:ascii="Tahoma" w:hAnsi="Tahoma" w:cs="Tahoma"/>
+                <w:b/>
+              </w:rPr>
+            </w:pPr>
+          </w:p>
+        </w:tc>
+        <w:tc>
+          <w:tcPr>
+            <w:tcW w:w="4819" w:type="dxa"/>
+            <w:tcBorders>
               <w:left w:val="nil"/>
               <w:bottom w:val="nil"/>
               <w:right w:val="nil"/>
             </w:tcBorders>
+            <w:vAlign w:val="center"/>
           </w:tcPr>
           <w:p>
             <w:pPr>
@@ -2274,21 +1600,28 @@
           <w:tcPr>
             <w:tcW w:w="4819" w:type="dxa"/>
             <w:tcBorders>
-              <w:top w:val="nil"/>
-              <w:left w:val="nil"/>
-              <w:bottom w:val="nil"/>
-              <w:right w:val="nil"/>
-            </w:tcBorders>
-          </w:tcPr>
-          <w:p>
-            <w:pPr>
-              <w:spacing w:after="0" w:line="240" w:lineRule="auto"/>
-              <w:jc w:val="center"/>
-              <w:rPr>
-                <w:rFonts w:ascii="Tahoma" w:hAnsi="Tahoma" w:cs="Tahoma"/>
-                <w:b/>
-              </w:rPr>
-            </w:pPr>
+              <w:top w:val="single" w:sz="4" w:space="0" w:color="auto"/>
+              <w:left w:val="single" w:sz="4" w:space="0" w:color="auto"/>
+              <w:bottom w:val="single" w:sz="4" w:space="0" w:color="auto"/>
+              <w:right w:val="single" w:sz="4" w:space="0" w:color="auto"/>
+            </w:tcBorders>
+          </w:tcPr>
+          <w:p>
+            <w:pPr>
+              <w:spacing w:after="0" w:line="240" w:lineRule="auto"/>
+              <w:jc w:val="center"/>
+              <w:rPr>
+                <w:rFonts w:ascii="Tahoma" w:hAnsi="Tahoma" w:cs="Tahoma"/>
+                <w:b/>
+              </w:rPr>
+            </w:pPr>
+            <w:r>
+              <w:rPr>
+                <w:rFonts w:ascii="Tahoma" w:hAnsi="Tahoma" w:cs="Tahoma"/>
+                <w:b/>
+              </w:rPr>
+              <w:t>TRANSFORMER OIL LEVEL INDICATOR</w:t>
+            </w:r>
           </w:p>
         </w:tc>
         <w:tc>
@@ -2296,7 +1629,7 @@
             <w:tcW w:w="426" w:type="dxa"/>
             <w:tcBorders>
               <w:top w:val="nil"/>
-              <w:left w:val="nil"/>
+              <w:left w:val="single" w:sz="4" w:space="0" w:color="auto"/>
               <w:bottom w:val="nil"/>
               <w:right w:val="nil"/>
             </w:tcBorders>
@@ -2342,10 +1675,10 @@
           <w:tcPr>
             <w:tcW w:w="4819" w:type="dxa"/>
             <w:tcBorders>
-              <w:top w:val="nil"/>
-              <w:left w:val="nil"/>
-              <w:bottom w:val="nil"/>
-              <w:right w:val="nil"/>
+              <w:top w:val="single" w:sz="4" w:space="0" w:color="auto"/>
+              <w:left w:val="single" w:sz="4" w:space="0" w:color="auto"/>
+              <w:bottom w:val="single" w:sz="4" w:space="0" w:color="auto"/>
+              <w:right w:val="single" w:sz="4" w:space="0" w:color="auto"/>
             </w:tcBorders>
             <w:vAlign w:val="center"/>
           </w:tcPr>
@@ -2365,7 +1698,7 @@
             <w:tcW w:w="426" w:type="dxa"/>
             <w:tcBorders>
               <w:top w:val="nil"/>
-              <w:left w:val="nil"/>
+              <w:left w:val="single" w:sz="4" w:space="0" w:color="auto"/>
               <w:bottom w:val="nil"/>
               <w:right w:val="nil"/>
             </w:tcBorders>
@@ -2410,7 +1743,7 @@
           <w:tcPr>
             <w:tcW w:w="4819" w:type="dxa"/>
             <w:tcBorders>
-              <w:top w:val="nil"/>
+              <w:top w:val="single" w:sz="4" w:space="0" w:color="auto"/>
               <w:left w:val="nil"/>
               <w:bottom w:val="nil"/>
               <w:right w:val="nil"/>
@@ -2524,7 +1857,6 @@
               <w:bottom w:val="nil"/>
               <w:right w:val="nil"/>
             </w:tcBorders>
-            <w:vAlign w:val="center"/>
           </w:tcPr>
           <w:p>
             <w:pPr>
@@ -3149,7 +2481,7 @@
   <w:style w:type="paragraph" w:default="1" w:styleId="Normal">
     <w:name w:val="Normal"/>
     <w:qFormat/>
-    <w:rsid w:val="00780E73"/>
+    <w:rsid w:val="004E61ED"/>
   </w:style>
   <w:style w:type="character" w:default="1" w:styleId="DefaultParagraphFont">
     <w:name w:val="Default Paragraph Font"/>

</xml_diff>

<commit_message>
feat(workflows): add testsheet folder generator & msms suite
- add 6-stage ETL GenerateTestsheetFolderStructureWorkflow as Action #1
- add interactive station/month/date selectors with auto 01. indexing
- decompose MSMS into Consolidate, Enrich, Propagate, Ingest & Populate
- add dynamic substation condition templates and canonical testsheet mapper
- add TotalPeRepository and MsmsRepository abstractions
- bump version to v1.8.0
</commit_message>
<xml_diff>
--- a/templates/QUICK REPORT/SUBSTATION CONFIGURATION/1. ID 1 TX 1 FP VI.docx
+++ b/templates/QUICK REPORT/SUBSTATION CONFIGURATION/1. ID 1 TX 1 FP VI.docx
@@ -1,6 +1,6 @@
 
 <file path=word/document.xml><?xml version="1.0" encoding="utf-8"?>
-<w:document xmlns:wpc="http://schemas.microsoft.com/office/word/2010/wordprocessingCanvas" xmlns:cx="http://schemas.microsoft.com/office/drawing/2014/chartex" xmlns:cx1="http://schemas.microsoft.com/office/drawing/2015/9/8/chartex" xmlns:cx2="http://schemas.microsoft.com/office/drawing/2015/10/21/chartex" xmlns:cx3="http://schemas.microsoft.com/office/drawing/2016/5/9/chartex" xmlns:cx4="http://schemas.microsoft.com/office/drawing/2016/5/10/chartex" xmlns:cx5="http://schemas.microsoft.com/office/drawing/2016/5/11/chartex" xmlns:cx6="http://schemas.microsoft.com/office/drawing/2016/5/12/chartex" xmlns:cx7="http://schemas.microsoft.com/office/drawing/2016/5/13/chartex" xmlns:cx8="http://schemas.microsoft.com/office/drawing/2016/5/14/chartex" xmlns:mc="http://schemas.openxmlformats.org/markup-compatibility/2006" xmlns:aink="http://schemas.microsoft.com/office/drawing/2016/ink" xmlns:am3d="http://schemas.microsoft.com/office/drawing/2017/model3d" xmlns:o="urn:schemas-microsoft-com:office:office" xmlns:oel="http://schemas.microsoft.com/office/2019/extlst" xmlns:r="http://schemas.openxmlformats.org/officeDocument/2006/relationships" xmlns:m="http://schemas.openxmlformats.org/officeDocument/2006/math" xmlns:v="urn:schemas-microsoft-com:vml" xmlns:wp14="http://schemas.microsoft.com/office/word/2010/wordprocessingDrawing" xmlns:wp="http://schemas.openxmlformats.org/drawingml/2006/wordprocessingDrawing" xmlns:w10="urn:schemas-microsoft-com:office:word" xmlns:w="http://schemas.openxmlformats.org/wordprocessingml/2006/main" xmlns:w14="http://schemas.microsoft.com/office/word/2010/wordml" xmlns:w15="http://schemas.microsoft.com/office/word/2012/wordml" xmlns:w16cex="http://schemas.microsoft.com/office/word/2018/wordml/cex" xmlns:w16cid="http://schemas.microsoft.com/office/word/2016/wordml/cid" xmlns:w16="http://schemas.microsoft.com/office/word/2018/wordml" xmlns:w16du="http://schemas.microsoft.com/office/word/2023/wordml/word16du" xmlns:w16sdtdh="http://schemas.microsoft.com/office/word/2020/wordml/sdtdatahash" xmlns:w16sdtfl="http://schemas.microsoft.com/office/word/2024/wordml/sdtformatlock" xmlns:w16se="http://schemas.microsoft.com/office/word/2015/wordml/symex" xmlns:wpg="http://schemas.microsoft.com/office/word/2010/wordprocessingGroup" xmlns:wpi="http://schemas.microsoft.com/office/word/2010/wordprocessingInk" xmlns:wne="http://schemas.microsoft.com/office/word/2006/wordml" xmlns:wps="http://schemas.microsoft.com/office/word/2010/wordprocessingShape" mc:Ignorable="w14 w15 w16se w16cid w16 w16cex w16sdtdh w16sdtfl w16du wp14">
+<w:document xmlns:wpc="http://schemas.microsoft.com/office/word/2010/wordprocessingCanvas" xmlns:cx="http://schemas.microsoft.com/office/drawing/2014/chartex" xmlns:cx1="http://schemas.microsoft.com/office/drawing/2015/9/8/chartex" xmlns:cx2="http://schemas.microsoft.com/office/drawing/2015/10/21/chartex" xmlns:cx3="http://schemas.microsoft.com/office/drawing/2016/5/9/chartex" xmlns:cx4="http://schemas.microsoft.com/office/drawing/2016/5/10/chartex" xmlns:cx5="http://schemas.microsoft.com/office/drawing/2016/5/11/chartex" xmlns:cx6="http://schemas.microsoft.com/office/drawing/2016/5/12/chartex" xmlns:cx7="http://schemas.microsoft.com/office/drawing/2016/5/13/chartex" xmlns:cx8="http://schemas.microsoft.com/office/drawing/2016/5/14/chartex" xmlns:mc="http://schemas.openxmlformats.org/markup-compatibility/2006" xmlns:aink="http://schemas.microsoft.com/office/drawing/2016/ink" xmlns:am3d="http://schemas.microsoft.com/office/drawing/2017/model3d" xmlns:o="urn:schemas-microsoft-com:office:office" xmlns:oel="http://schemas.microsoft.com/office/2019/extlst" xmlns:r="http://schemas.openxmlformats.org/officeDocument/2006/relationships" xmlns:m="http://schemas.openxmlformats.org/officeDocument/2006/math" xmlns:v="urn:schemas-microsoft-com:vml" xmlns:wp14="http://schemas.microsoft.com/office/word/2010/wordprocessingDrawing" xmlns:wp="http://schemas.openxmlformats.org/drawingml/2006/wordprocessingDrawing" xmlns:w10="urn:schemas-microsoft-com:office:word" xmlns:w="http://schemas.openxmlformats.org/wordprocessingml/2006/main" xmlns:w14="http://schemas.microsoft.com/office/word/2010/wordml" xmlns:w15="http://schemas.microsoft.com/office/word/2012/wordml" xmlns:w16cei="http://schemas.microsoft.com/office/word/2026/wordml/cei" xmlns:w16cex="http://schemas.microsoft.com/office/word/2018/wordml/cex" xmlns:w16cid="http://schemas.microsoft.com/office/word/2016/wordml/cid" xmlns:w16="http://schemas.microsoft.com/office/word/2018/wordml" xmlns:w16du="http://schemas.microsoft.com/office/word/2023/wordml/word16du" xmlns:w16sdtdh="http://schemas.microsoft.com/office/word/2020/wordml/sdtdatahash" xmlns:w16sdtfl="http://schemas.microsoft.com/office/word/2024/wordml/sdtformatlock" xmlns:w16se="http://schemas.microsoft.com/office/word/2015/wordml/symex" xmlns:wpg="http://schemas.microsoft.com/office/word/2010/wordprocessingGroup" xmlns:wpi="http://schemas.microsoft.com/office/word/2010/wordprocessingInk" xmlns:wne="http://schemas.microsoft.com/office/word/2006/wordml" xmlns:wps="http://schemas.microsoft.com/office/word/2010/wordprocessingShape" mc:Ignorable="w14 w15 w16se w16cid w16 w16cex w16sdtdh w16sdtfl w16du wp14">
   <w:body>
     <w:p>
       <w:pPr>
@@ -1219,6 +1219,7 @@
               <w:bottom w:val="single" w:sz="4" w:space="0" w:color="auto"/>
               <w:right w:val="single" w:sz="4" w:space="0" w:color="auto"/>
             </w:tcBorders>
+            <w:vAlign w:val="center"/>
           </w:tcPr>
           <w:p>
             <w:pPr>
@@ -1442,6 +1443,7 @@
               <w:left w:val="single" w:sz="4" w:space="0" w:color="auto"/>
               <w:bottom w:val="single" w:sz="4" w:space="0" w:color="auto"/>
             </w:tcBorders>
+            <w:vAlign w:val="center"/>
           </w:tcPr>
           <w:p>
             <w:pPr>
@@ -1958,7 +1960,7 @@
 </file>
 
 <file path=word/numbering.xml><?xml version="1.0" encoding="utf-8"?>
-<w:numbering xmlns:wpc="http://schemas.microsoft.com/office/word/2010/wordprocessingCanvas" xmlns:cx="http://schemas.microsoft.com/office/drawing/2014/chartex" xmlns:cx1="http://schemas.microsoft.com/office/drawing/2015/9/8/chartex" xmlns:cx2="http://schemas.microsoft.com/office/drawing/2015/10/21/chartex" xmlns:cx3="http://schemas.microsoft.com/office/drawing/2016/5/9/chartex" xmlns:cx4="http://schemas.microsoft.com/office/drawing/2016/5/10/chartex" xmlns:cx5="http://schemas.microsoft.com/office/drawing/2016/5/11/chartex" xmlns:cx6="http://schemas.microsoft.com/office/drawing/2016/5/12/chartex" xmlns:cx7="http://schemas.microsoft.com/office/drawing/2016/5/13/chartex" xmlns:cx8="http://schemas.microsoft.com/office/drawing/2016/5/14/chartex" xmlns:mc="http://schemas.openxmlformats.org/markup-compatibility/2006" xmlns:aink="http://schemas.microsoft.com/office/drawing/2016/ink" xmlns:am3d="http://schemas.microsoft.com/office/drawing/2017/model3d" xmlns:o="urn:schemas-microsoft-com:office:office" xmlns:oel="http://schemas.microsoft.com/office/2019/extlst" xmlns:r="http://schemas.openxmlformats.org/officeDocument/2006/relationships" xmlns:m="http://schemas.openxmlformats.org/officeDocument/2006/math" xmlns:v="urn:schemas-microsoft-com:vml" xmlns:wp14="http://schemas.microsoft.com/office/word/2010/wordprocessingDrawing" xmlns:wp="http://schemas.openxmlformats.org/drawingml/2006/wordprocessingDrawing" xmlns:w10="urn:schemas-microsoft-com:office:word" xmlns:w="http://schemas.openxmlformats.org/wordprocessingml/2006/main" xmlns:w14="http://schemas.microsoft.com/office/word/2010/wordml" xmlns:w15="http://schemas.microsoft.com/office/word/2012/wordml" xmlns:w16cex="http://schemas.microsoft.com/office/word/2018/wordml/cex" xmlns:w16cid="http://schemas.microsoft.com/office/word/2016/wordml/cid" xmlns:w16="http://schemas.microsoft.com/office/word/2018/wordml" xmlns:w16du="http://schemas.microsoft.com/office/word/2023/wordml/word16du" xmlns:w16sdtdh="http://schemas.microsoft.com/office/word/2020/wordml/sdtdatahash" xmlns:w16sdtfl="http://schemas.microsoft.com/office/word/2024/wordml/sdtformatlock" xmlns:w16se="http://schemas.microsoft.com/office/word/2015/wordml/symex" xmlns:wpg="http://schemas.microsoft.com/office/word/2010/wordprocessingGroup" xmlns:wpi="http://schemas.microsoft.com/office/word/2010/wordprocessingInk" xmlns:wne="http://schemas.microsoft.com/office/word/2006/wordml" xmlns:wps="http://schemas.microsoft.com/office/word/2010/wordprocessingShape" mc:Ignorable="w14 w15 w16se w16cid w16 w16cex w16sdtdh w16sdtfl w16du wp14">
+<w:numbering xmlns:wpc="http://schemas.microsoft.com/office/word/2010/wordprocessingCanvas" xmlns:cx="http://schemas.microsoft.com/office/drawing/2014/chartex" xmlns:cx1="http://schemas.microsoft.com/office/drawing/2015/9/8/chartex" xmlns:cx2="http://schemas.microsoft.com/office/drawing/2015/10/21/chartex" xmlns:cx3="http://schemas.microsoft.com/office/drawing/2016/5/9/chartex" xmlns:cx4="http://schemas.microsoft.com/office/drawing/2016/5/10/chartex" xmlns:cx5="http://schemas.microsoft.com/office/drawing/2016/5/11/chartex" xmlns:cx6="http://schemas.microsoft.com/office/drawing/2016/5/12/chartex" xmlns:cx7="http://schemas.microsoft.com/office/drawing/2016/5/13/chartex" xmlns:cx8="http://schemas.microsoft.com/office/drawing/2016/5/14/chartex" xmlns:mc="http://schemas.openxmlformats.org/markup-compatibility/2006" xmlns:aink="http://schemas.microsoft.com/office/drawing/2016/ink" xmlns:am3d="http://schemas.microsoft.com/office/drawing/2017/model3d" xmlns:o="urn:schemas-microsoft-com:office:office" xmlns:oel="http://schemas.microsoft.com/office/2019/extlst" xmlns:r="http://schemas.openxmlformats.org/officeDocument/2006/relationships" xmlns:m="http://schemas.openxmlformats.org/officeDocument/2006/math" xmlns:v="urn:schemas-microsoft-com:vml" xmlns:wp14="http://schemas.microsoft.com/office/word/2010/wordprocessingDrawing" xmlns:wp="http://schemas.openxmlformats.org/drawingml/2006/wordprocessingDrawing" xmlns:w10="urn:schemas-microsoft-com:office:word" xmlns:w="http://schemas.openxmlformats.org/wordprocessingml/2006/main" xmlns:w14="http://schemas.microsoft.com/office/word/2010/wordml" xmlns:w15="http://schemas.microsoft.com/office/word/2012/wordml" xmlns:w16cei="http://schemas.microsoft.com/office/word/2026/wordml/cei" xmlns:w16cex="http://schemas.microsoft.com/office/word/2018/wordml/cex" xmlns:w16cid="http://schemas.microsoft.com/office/word/2016/wordml/cid" xmlns:w16="http://schemas.microsoft.com/office/word/2018/wordml" xmlns:w16du="http://schemas.microsoft.com/office/word/2023/wordml/word16du" xmlns:w16sdtdh="http://schemas.microsoft.com/office/word/2020/wordml/sdtdatahash" xmlns:w16sdtfl="http://schemas.microsoft.com/office/word/2024/wordml/sdtformatlock" xmlns:w16se="http://schemas.microsoft.com/office/word/2015/wordml/symex" xmlns:wpg="http://schemas.microsoft.com/office/word/2010/wordprocessingGroup" xmlns:wpi="http://schemas.microsoft.com/office/word/2010/wordprocessingInk" xmlns:wne="http://schemas.microsoft.com/office/word/2006/wordml" xmlns:wps="http://schemas.microsoft.com/office/word/2010/wordprocessingShape" mc:Ignorable="w14 w15 w16se w16cid w16 w16cex w16sdtdh w16sdtfl w16du wp14">
   <w:abstractNum w:abstractNumId="0" w15:restartNumberingAfterBreak="0">
     <w:nsid w:val="3B056B8E"/>
     <w:multiLevelType w:val="hybridMultilevel"/>

</xml_diff>

<commit_message>
feat(quick-report): dynamic substation condition pages
- Extract equipment specs across all 5 substation variants

- Dynamically pack condition pairs with dedicated room fire safety

- Clean empty card borders and center header cell layout

- Sync release documentation and bump version to v1.10.0
</commit_message>
<xml_diff>
--- a/templates/QUICK REPORT/SUBSTATION CONFIGURATION/1. ID 1 TX 1 FP VI.docx
+++ b/templates/QUICK REPORT/SUBSTATION CONFIGURATION/1. ID 1 TX 1 FP VI.docx
@@ -83,6 +83,7 @@
               <w:bottom w:val="single" w:sz="4" w:space="0" w:color="auto"/>
               <w:right w:val="single" w:sz="4" w:space="0" w:color="auto"/>
             </w:tcBorders>
+            <w:vAlign w:val="center"/>
           </w:tcPr>
           <w:p>
             <w:pPr>
@@ -137,6 +138,7 @@
               <w:left w:val="single" w:sz="4" w:space="0" w:color="auto"/>
               <w:bottom w:val="single" w:sz="4" w:space="0" w:color="auto"/>
             </w:tcBorders>
+            <w:vAlign w:val="center"/>
           </w:tcPr>
           <w:p>
             <w:pPr>
@@ -299,6 +301,7 @@
               <w:bottom w:val="single" w:sz="4" w:space="0" w:color="auto"/>
               <w:right w:val="single" w:sz="4" w:space="0" w:color="auto"/>
             </w:tcBorders>
+            <w:vAlign w:val="center"/>
           </w:tcPr>
           <w:p>
             <w:pPr>
@@ -347,6 +350,7 @@
               <w:left w:val="single" w:sz="4" w:space="0" w:color="auto"/>
               <w:bottom w:val="single" w:sz="4" w:space="0" w:color="auto"/>
             </w:tcBorders>
+            <w:vAlign w:val="center"/>
           </w:tcPr>
           <w:p>
             <w:pPr>
@@ -516,6 +520,7 @@
               <w:bottom w:val="single" w:sz="4" w:space="0" w:color="auto"/>
               <w:right w:val="single" w:sz="4" w:space="0" w:color="auto"/>
             </w:tcBorders>
+            <w:vAlign w:val="center"/>
           </w:tcPr>
           <w:p>
             <w:pPr>
@@ -565,6 +570,7 @@
               <w:left w:val="single" w:sz="4" w:space="0" w:color="auto"/>
               <w:bottom w:val="single" w:sz="4" w:space="0" w:color="auto"/>
             </w:tcBorders>
+            <w:vAlign w:val="center"/>
           </w:tcPr>
           <w:p>
             <w:pPr>
@@ -729,6 +735,7 @@
               <w:bottom w:val="single" w:sz="4" w:space="0" w:color="auto"/>
               <w:right w:val="single" w:sz="4" w:space="0" w:color="auto"/>
             </w:tcBorders>
+            <w:vAlign w:val="center"/>
           </w:tcPr>
           <w:p>
             <w:pPr>
@@ -776,6 +783,7 @@
               <w:left w:val="single" w:sz="4" w:space="0" w:color="auto"/>
               <w:bottom w:val="single" w:sz="4" w:space="0" w:color="auto"/>
             </w:tcBorders>
+            <w:vAlign w:val="center"/>
           </w:tcPr>
           <w:p>
             <w:pPr>
@@ -945,6 +953,7 @@
               <w:bottom w:val="single" w:sz="4" w:space="0" w:color="auto"/>
               <w:right w:val="single" w:sz="4" w:space="0" w:color="auto"/>
             </w:tcBorders>
+            <w:vAlign w:val="center"/>
           </w:tcPr>
           <w:p>
             <w:pPr>
@@ -995,6 +1004,7 @@
               <w:bottom w:val="single" w:sz="4" w:space="0" w:color="auto"/>
               <w:right w:val="single" w:sz="4" w:space="0" w:color="auto"/>
             </w:tcBorders>
+            <w:vAlign w:val="center"/>
           </w:tcPr>
           <w:p>
             <w:pPr>
@@ -1161,6 +1171,7 @@
               <w:bottom w:val="single" w:sz="4" w:space="0" w:color="auto"/>
               <w:right w:val="single" w:sz="4" w:space="0" w:color="auto"/>
             </w:tcBorders>
+            <w:vAlign w:val="center"/>
           </w:tcPr>
           <w:p>
             <w:pPr>
@@ -1388,6 +1399,7 @@
               <w:bottom w:val="single" w:sz="4" w:space="0" w:color="auto"/>
               <w:right w:val="single" w:sz="4" w:space="0" w:color="auto"/>
             </w:tcBorders>
+            <w:vAlign w:val="center"/>
           </w:tcPr>
           <w:p>
             <w:pPr>
@@ -1607,6 +1619,7 @@
               <w:bottom w:val="single" w:sz="4" w:space="0" w:color="auto"/>
               <w:right w:val="single" w:sz="4" w:space="0" w:color="auto"/>
             </w:tcBorders>
+            <w:vAlign w:val="center"/>
           </w:tcPr>
           <w:p>
             <w:pPr>

</xml_diff>